<commit_message>
Refs #274. Fixed typo
</commit_message>
<xml_diff>
--- a/tests/fixtures/table_with_multi_rowspan.docx
+++ b/tests/fixtures/table_with_multi_rowspan.docx
@@ -1,18 +1,13 @@
 
 <file path=word/document.xml><?xml version="1.0" encoding="utf-8"?>
-<w:document xmlns:o="urn:schemas-microsoft-com:office:office" xmlns:r="http://schemas.openxmlformats.org/officeDocument/2006/relationships" xmlns:v="urn:schemas-microsoft-com:vml" xmlns:w="http://schemas.openxmlformats.org/wordprocessingml/2006/main" xmlns:w10="urn:schemas-microsoft-com:office:word" xmlns:wp="http://schemas.openxmlformats.org/drawingml/2006/wordprocessingDrawing" xmlns:wps="http://schemas.microsoft.com/office/word/2010/wordprocessingShape" xmlns:wpg="http://schemas.microsoft.com/office/word/2010/wordprocessingGroup" xmlns:mc="http://schemas.openxmlformats.org/markup-compatibility/2006" xmlns:wp14="http://schemas.microsoft.com/office/word/2010/wordprocessingDrawing" xmlns:w14="http://schemas.microsoft.com/office/word/2010/wordml" mc:Ignorable="w14 wp14">
+<w:document xmlns:o="urn:schemas-microsoft-com:office:office" xmlns:r="http://schemas.openxmlformats.org/officeDocument/2006/relationships" xmlns:v="urn:schemas-microsoft-com:vml" xmlns:w="http://schemas.openxmlformats.org/wordprocessingml/2006/main" xmlns:w10="urn:schemas-microsoft-com:office:word" xmlns:wp="http://schemas.openxmlformats.org/drawingml/2006/wordprocessingDrawing" xmlns:wps="http://schemas.microsoft.com/office/word/2010/wordprocessingShape" xmlns:wpg="http://schemas.microsoft.com/office/word/2010/wordprocessingGroup" xmlns:mc="http://schemas.openxmlformats.org/markup-compatibility/2006" xmlns:wp14="http://schemas.microsoft.com/office/word/2010/wordprocessingDrawing" xmlns:w14="http://schemas.microsoft.com/office/word/2010/wordml" xmlns:w15="http://schemas.microsoft.com/office/word/2012/wordml" mc:Ignorable="w14 wp14 w15">
   <w:body>
     <w:tbl>
       <w:tblPr>
         <w:tblW w:w="9972" w:type="dxa"/>
         <w:jc w:val="left"/>
-        <w:tblInd w:w="55" w:type="dxa"/>
-        <w:tblBorders>
-          <w:top w:val="single" w:sz="2" w:space="0" w:color="000000"/>
-          <w:left w:val="single" w:sz="2" w:space="0" w:color="000000"/>
-          <w:bottom w:val="single" w:sz="2" w:space="0" w:color="000000"/>
-          <w:insideH w:val="single" w:sz="2" w:space="0" w:color="000000"/>
-        </w:tblBorders>
+        <w:tblInd w:w="111" w:type="dxa"/>
+        <w:tblLayout w:type="fixed"/>
         <w:tblCellMar>
           <w:top w:w="55" w:type="dxa"/>
           <w:left w:w="54" w:type="dxa"/>
@@ -22,7 +17,7 @@
       </w:tblPr>
       <w:tblGrid>
         <w:gridCol w:w="4986"/>
-        <w:gridCol w:w="4986"/>
+        <w:gridCol w:w="4985"/>
       </w:tblGrid>
       <w:tr>
         <w:trPr/>
@@ -34,12 +29,8 @@
               <w:top w:val="single" w:sz="2" w:space="0" w:color="000000"/>
               <w:left w:val="single" w:sz="2" w:space="0" w:color="000000"/>
               <w:bottom w:val="single" w:sz="2" w:space="0" w:color="000000"/>
-              <w:insideH w:val="single" w:sz="2" w:space="0" w:color="000000"/>
-            </w:tcBorders>
-            <w:shd w:fill="auto" w:val="clear"/>
-            <w:tcMar>
-              <w:left w:w="54" w:type="dxa"/>
-            </w:tcMar>
+            </w:tcBorders>
+            <w:shd w:fill="auto" w:val="clear"/>
           </w:tcPr>
           <w:p>
             <w:pPr>
@@ -54,19 +45,14 @@
         </w:tc>
         <w:tc>
           <w:tcPr>
-            <w:tcW w:w="4986" w:type="dxa"/>
+            <w:tcW w:w="4985" w:type="dxa"/>
             <w:tcBorders>
               <w:top w:val="single" w:sz="2" w:space="0" w:color="000000"/>
               <w:left w:val="single" w:sz="2" w:space="0" w:color="000000"/>
               <w:bottom w:val="single" w:sz="2" w:space="0" w:color="000000"/>
               <w:right w:val="single" w:sz="2" w:space="0" w:color="000000"/>
-              <w:insideH w:val="single" w:sz="2" w:space="0" w:color="000000"/>
-              <w:insideV w:val="single" w:sz="2" w:space="0" w:color="000000"/>
-            </w:tcBorders>
-            <w:shd w:fill="auto" w:val="clear"/>
-            <w:tcMar>
-              <w:left w:w="54" w:type="dxa"/>
-            </w:tcMar>
+            </w:tcBorders>
+            <w:shd w:fill="auto" w:val="clear"/>
           </w:tcPr>
           <w:p>
             <w:pPr>
@@ -90,37 +76,29 @@
               <w:top w:val="single" w:sz="2" w:space="0" w:color="000000"/>
               <w:left w:val="single" w:sz="2" w:space="0" w:color="000000"/>
               <w:bottom w:val="single" w:sz="2" w:space="0" w:color="000000"/>
-              <w:insideH w:val="single" w:sz="2" w:space="0" w:color="000000"/>
-            </w:tcBorders>
-            <w:shd w:fill="auto" w:val="clear"/>
-            <w:tcMar>
-              <w:left w:w="54" w:type="dxa"/>
-            </w:tcMar>
-          </w:tcPr>
-          <w:p>
-            <w:pPr>
-              <w:pStyle w:val="TableContents"/>
-              <w:rPr/>
-            </w:pPr>
-            <w:r>
-              <w:rPr/>
-            </w:r>
-          </w:p>
-        </w:tc>
-        <w:tc>
-          <w:tcPr>
-            <w:tcW w:w="4986" w:type="dxa"/>
-            <w:tcBorders>
+            </w:tcBorders>
+            <w:shd w:fill="auto" w:val="clear"/>
+          </w:tcPr>
+          <w:p>
+            <w:pPr>
+              <w:pStyle w:val="TableContents"/>
+              <w:rPr/>
+            </w:pPr>
+            <w:r>
+              <w:rPr/>
+            </w:r>
+          </w:p>
+        </w:tc>
+        <w:tc>
+          <w:tcPr>
+            <w:tcW w:w="4985" w:type="dxa"/>
+            <w:tcBorders>
+              <w:top w:val="single" w:sz="2" w:space="0" w:color="000000"/>
               <w:left w:val="single" w:sz="2" w:space="0" w:color="000000"/>
               <w:bottom w:val="single" w:sz="2" w:space="0" w:color="000000"/>
               <w:right w:val="single" w:sz="2" w:space="0" w:color="000000"/>
-              <w:insideH w:val="single" w:sz="2" w:space="0" w:color="000000"/>
-              <w:insideV w:val="single" w:sz="2" w:space="0" w:color="000000"/>
-            </w:tcBorders>
-            <w:shd w:fill="auto" w:val="clear"/>
-            <w:tcMar>
-              <w:left w:w="54" w:type="dxa"/>
-            </w:tcMar>
+            </w:tcBorders>
+            <w:shd w:fill="auto" w:val="clear"/>
           </w:tcPr>
           <w:p>
             <w:pPr>
@@ -141,14 +119,11 @@
             <w:tcW w:w="4986" w:type="dxa"/>
             <w:vMerge w:val="restart"/>
             <w:tcBorders>
-              <w:left w:val="single" w:sz="2" w:space="0" w:color="000000"/>
-              <w:bottom w:val="single" w:sz="2" w:space="0" w:color="000000"/>
-              <w:insideH w:val="single" w:sz="2" w:space="0" w:color="000000"/>
-            </w:tcBorders>
-            <w:shd w:fill="auto" w:val="clear"/>
-            <w:tcMar>
-              <w:left w:w="54" w:type="dxa"/>
-            </w:tcMar>
+              <w:top w:val="single" w:sz="2" w:space="0" w:color="000000"/>
+              <w:left w:val="single" w:sz="2" w:space="0" w:color="000000"/>
+              <w:bottom w:val="single" w:sz="2" w:space="0" w:color="000000"/>
+            </w:tcBorders>
+            <w:shd w:fill="auto" w:val="clear"/>
           </w:tcPr>
           <w:p>
             <w:pPr>
@@ -163,18 +138,14 @@
         </w:tc>
         <w:tc>
           <w:tcPr>
-            <w:tcW w:w="4986" w:type="dxa"/>
-            <w:tcBorders>
+            <w:tcW w:w="4985" w:type="dxa"/>
+            <w:tcBorders>
+              <w:top w:val="single" w:sz="2" w:space="0" w:color="000000"/>
               <w:left w:val="single" w:sz="2" w:space="0" w:color="000000"/>
               <w:bottom w:val="single" w:sz="2" w:space="0" w:color="000000"/>
               <w:right w:val="single" w:sz="2" w:space="0" w:color="000000"/>
-              <w:insideH w:val="single" w:sz="2" w:space="0" w:color="000000"/>
-              <w:insideV w:val="single" w:sz="2" w:space="0" w:color="000000"/>
-            </w:tcBorders>
-            <w:shd w:fill="auto" w:val="clear"/>
-            <w:tcMar>
-              <w:left w:w="54" w:type="dxa"/>
-            </w:tcMar>
+            </w:tcBorders>
+            <w:shd w:fill="auto" w:val="clear"/>
           </w:tcPr>
           <w:p>
             <w:pPr>
@@ -195,39 +166,32 @@
             <w:tcW w:w="4986" w:type="dxa"/>
             <w:vMerge w:val="continue"/>
             <w:tcBorders>
-              <w:left w:val="single" w:sz="2" w:space="0" w:color="000000"/>
-              <w:bottom w:val="single" w:sz="2" w:space="0" w:color="000000"/>
-              <w:insideH w:val="single" w:sz="2" w:space="0" w:color="000000"/>
-            </w:tcBorders>
-            <w:shd w:fill="auto" w:val="clear"/>
-            <w:tcMar>
-              <w:left w:w="54" w:type="dxa"/>
-            </w:tcMar>
-          </w:tcPr>
-          <w:p>
-            <w:pPr>
-              <w:pStyle w:val="TableContents"/>
-              <w:rPr/>
-            </w:pPr>
-            <w:r>
-              <w:rPr/>
-            </w:r>
-          </w:p>
-        </w:tc>
-        <w:tc>
-          <w:tcPr>
-            <w:tcW w:w="4986" w:type="dxa"/>
-            <w:tcBorders>
+              <w:top w:val="single" w:sz="2" w:space="0" w:color="000000"/>
+              <w:left w:val="single" w:sz="2" w:space="0" w:color="000000"/>
+              <w:bottom w:val="single" w:sz="2" w:space="0" w:color="000000"/>
+            </w:tcBorders>
+            <w:shd w:fill="auto" w:val="clear"/>
+          </w:tcPr>
+          <w:p>
+            <w:pPr>
+              <w:pStyle w:val="TableContents"/>
+              <w:rPr/>
+            </w:pPr>
+            <w:r>
+              <w:rPr/>
+            </w:r>
+          </w:p>
+        </w:tc>
+        <w:tc>
+          <w:tcPr>
+            <w:tcW w:w="4985" w:type="dxa"/>
+            <w:tcBorders>
+              <w:top w:val="single" w:sz="2" w:space="0" w:color="000000"/>
               <w:left w:val="single" w:sz="2" w:space="0" w:color="000000"/>
               <w:bottom w:val="single" w:sz="2" w:space="0" w:color="000000"/>
               <w:right w:val="single" w:sz="2" w:space="0" w:color="000000"/>
-              <w:insideH w:val="single" w:sz="2" w:space="0" w:color="000000"/>
-              <w:insideV w:val="single" w:sz="2" w:space="0" w:color="000000"/>
-            </w:tcBorders>
-            <w:shd w:fill="auto" w:val="clear"/>
-            <w:tcMar>
-              <w:left w:w="54" w:type="dxa"/>
-            </w:tcMar>
+            </w:tcBorders>
+            <w:shd w:fill="auto" w:val="clear"/>
           </w:tcPr>
           <w:p>
             <w:pPr>
@@ -248,39 +212,32 @@
             <w:tcW w:w="4986" w:type="dxa"/>
             <w:vMerge w:val="continue"/>
             <w:tcBorders>
-              <w:left w:val="single" w:sz="2" w:space="0" w:color="000000"/>
-              <w:bottom w:val="single" w:sz="2" w:space="0" w:color="000000"/>
-              <w:insideH w:val="single" w:sz="2" w:space="0" w:color="000000"/>
-            </w:tcBorders>
-            <w:shd w:fill="auto" w:val="clear"/>
-            <w:tcMar>
-              <w:left w:w="54" w:type="dxa"/>
-            </w:tcMar>
-          </w:tcPr>
-          <w:p>
-            <w:pPr>
-              <w:pStyle w:val="TableContents"/>
-              <w:rPr/>
-            </w:pPr>
-            <w:r>
-              <w:rPr/>
-            </w:r>
-          </w:p>
-        </w:tc>
-        <w:tc>
-          <w:tcPr>
-            <w:tcW w:w="4986" w:type="dxa"/>
-            <w:tcBorders>
+              <w:top w:val="single" w:sz="2" w:space="0" w:color="000000"/>
+              <w:left w:val="single" w:sz="2" w:space="0" w:color="000000"/>
+              <w:bottom w:val="single" w:sz="2" w:space="0" w:color="000000"/>
+            </w:tcBorders>
+            <w:shd w:fill="auto" w:val="clear"/>
+          </w:tcPr>
+          <w:p>
+            <w:pPr>
+              <w:pStyle w:val="TableContents"/>
+              <w:rPr/>
+            </w:pPr>
+            <w:r>
+              <w:rPr/>
+            </w:r>
+          </w:p>
+        </w:tc>
+        <w:tc>
+          <w:tcPr>
+            <w:tcW w:w="4985" w:type="dxa"/>
+            <w:tcBorders>
+              <w:top w:val="single" w:sz="2" w:space="0" w:color="000000"/>
               <w:left w:val="single" w:sz="2" w:space="0" w:color="000000"/>
               <w:bottom w:val="single" w:sz="2" w:space="0" w:color="000000"/>
               <w:right w:val="single" w:sz="2" w:space="0" w:color="000000"/>
-              <w:insideH w:val="single" w:sz="2" w:space="0" w:color="000000"/>
-              <w:insideV w:val="single" w:sz="2" w:space="0" w:color="000000"/>
-            </w:tcBorders>
-            <w:shd w:fill="auto" w:val="clear"/>
-            <w:tcMar>
-              <w:left w:w="54" w:type="dxa"/>
-            </w:tcMar>
+            </w:tcBorders>
+            <w:shd w:fill="auto" w:val="clear"/>
           </w:tcPr>
           <w:p>
             <w:pPr>
@@ -301,48 +258,45 @@
             <w:tcW w:w="4986" w:type="dxa"/>
             <w:vMerge w:val="continue"/>
             <w:tcBorders>
-              <w:left w:val="single" w:sz="2" w:space="0" w:color="000000"/>
-              <w:bottom w:val="single" w:sz="2" w:space="0" w:color="000000"/>
-              <w:insideH w:val="single" w:sz="2" w:space="0" w:color="000000"/>
-            </w:tcBorders>
-            <w:shd w:fill="auto" w:val="clear"/>
-            <w:tcMar>
-              <w:left w:w="54" w:type="dxa"/>
-            </w:tcMar>
-          </w:tcPr>
-          <w:p>
-            <w:pPr>
-              <w:pStyle w:val="TableContents"/>
-              <w:rPr/>
-            </w:pPr>
-            <w:r>
-              <w:rPr/>
-            </w:r>
-          </w:p>
-        </w:tc>
-        <w:tc>
-          <w:tcPr>
-            <w:tcW w:w="4986" w:type="dxa"/>
-            <w:tcBorders>
+              <w:top w:val="single" w:sz="2" w:space="0" w:color="000000"/>
+              <w:left w:val="single" w:sz="2" w:space="0" w:color="000000"/>
+              <w:bottom w:val="single" w:sz="2" w:space="0" w:color="000000"/>
+            </w:tcBorders>
+            <w:shd w:fill="auto" w:val="clear"/>
+          </w:tcPr>
+          <w:p>
+            <w:pPr>
+              <w:pStyle w:val="TableContents"/>
+              <w:rPr/>
+            </w:pPr>
+            <w:r>
+              <w:rPr/>
+            </w:r>
+          </w:p>
+        </w:tc>
+        <w:tc>
+          <w:tcPr>
+            <w:tcW w:w="4985" w:type="dxa"/>
+            <w:tcBorders>
+              <w:top w:val="single" w:sz="2" w:space="0" w:color="000000"/>
               <w:left w:val="single" w:sz="2" w:space="0" w:color="000000"/>
               <w:bottom w:val="single" w:sz="2" w:space="0" w:color="000000"/>
               <w:right w:val="single" w:sz="2" w:space="0" w:color="000000"/>
-              <w:insideH w:val="single" w:sz="2" w:space="0" w:color="000000"/>
-              <w:insideV w:val="single" w:sz="2" w:space="0" w:color="000000"/>
-            </w:tcBorders>
-            <w:shd w:fill="auto" w:val="clear"/>
-            <w:tcMar>
-              <w:left w:w="54" w:type="dxa"/>
-            </w:tcMar>
-          </w:tcPr>
-          <w:p>
-            <w:pPr>
-              <w:pStyle w:val="TableContents"/>
-              <w:rPr/>
-            </w:pPr>
-            <w:r>
-              <w:rPr/>
-              <w:t>Imte 4</w:t>
+            </w:tcBorders>
+            <w:shd w:fill="auto" w:val="clear"/>
+          </w:tcPr>
+          <w:p>
+            <w:pPr>
+              <w:pStyle w:val="TableContents"/>
+              <w:rPr/>
+            </w:pPr>
+            <w:r>
+              <w:rPr/>
+              <w:t>Item</w:t>
+            </w:r>
+            <w:r>
+              <w:rPr/>
+              <w:t xml:space="preserve"> 4</w:t>
             </w:r>
           </w:p>
         </w:tc>
@@ -360,10 +314,11 @@
     <w:sectPr>
       <w:type w:val="nextPage"/>
       <w:pgSz w:w="12240" w:h="15840"/>
-      <w:pgMar w:left="1134" w:right="1134" w:header="0" w:top="1134" w:footer="0" w:bottom="1134" w:gutter="0"/>
+      <w:pgMar w:left="1134" w:right="1134" w:gutter="0" w:header="0" w:top="1134" w:footer="0" w:bottom="1134"/>
       <w:pgNumType w:fmt="decimal"/>
       <w:formProt w:val="false"/>
       <w:textDirection w:val="lrTb"/>
+      <w:docGrid w:type="default" w:linePitch="100" w:charSpace="0"/>
     </w:sectPr>
   </w:body>
 </w:document>
@@ -381,7 +336,9 @@
       </w:rPr>
     </w:rPrDefault>
     <w:pPrDefault>
-      <w:pPr/>
+      <w:pPr>
+        <w:suppressAutoHyphens w:val="true"/>
+      </w:pPr>
     </w:pPrDefault>
   </w:docDefaults>
   <w:style w:type="paragraph" w:styleId="Normal">
@@ -390,10 +347,14 @@
     <w:pPr>
       <w:widowControl w:val="false"/>
       <w:suppressAutoHyphens w:val="true"/>
+      <w:bidi w:val="0"/>
+      <w:spacing w:before="0" w:after="0"/>
+      <w:jc w:val="left"/>
     </w:pPr>
     <w:rPr>
       <w:rFonts w:ascii="Times New Roman" w:hAnsi="Times New Roman" w:eastAsia="AR PL SungtiL GB" w:cs="FreeSans"/>
       <w:color w:val="auto"/>
+      <w:kern w:val="0"/>
       <w:sz w:val="32"/>
       <w:szCs w:val="24"/>
       <w:lang w:val="en-US" w:eastAsia="zh-CN" w:bidi="hi-IN"/>
@@ -405,7 +366,7 @@
     <w:next w:val="TextBody"/>
     <w:qFormat/>
     <w:pPr>
-      <w:keepNext/>
+      <w:keepNext w:val="true"/>
       <w:spacing w:before="240" w:after="120"/>
     </w:pPr>
     <w:rPr>
@@ -414,11 +375,11 @@
       <w:szCs w:val="28"/>
     </w:rPr>
   </w:style>
-  <w:style w:type="paragraph" w:styleId="TextBody">
-    <w:name w:val="Text Body"/>
+  <w:style w:type="paragraph" w:styleId="BodyText">
+    <w:name w:val="Body Text"/>
     <w:basedOn w:val="Normal"/>
     <w:pPr>
-      <w:spacing w:lineRule="auto" w:line="288" w:before="0" w:after="140"/>
+      <w:spacing w:lineRule="auto" w:line="276" w:before="0" w:after="140"/>
     </w:pPr>
     <w:rPr/>
   </w:style>
@@ -459,6 +420,15 @@
       <w:sz w:val="24"/>
     </w:rPr>
   </w:style>
+  <w:style w:type="paragraph" w:styleId="TextBody">
+    <w:name w:val="Text Body"/>
+    <w:basedOn w:val="Normal"/>
+    <w:qFormat/>
+    <w:pPr>
+      <w:spacing w:lineRule="auto" w:line="288" w:before="0" w:after="140"/>
+    </w:pPr>
+    <w:rPr/>
+  </w:style>
   <w:style w:type="paragraph" w:styleId="TableContents">
     <w:name w:val="Table Contents"/>
     <w:basedOn w:val="Normal"/>
@@ -469,4 +439,110 @@
     <w:rPr/>
   </w:style>
 </w:styles>
+</file>
+
+<file path=word/theme/theme1.xml><?xml version="1.0" encoding="utf-8"?>
+<a:theme xmlns:a="http://schemas.openxmlformats.org/drawingml/2006/main" xmlns:r="http://schemas.openxmlformats.org/officeDocument/2006/relationships" name="Office">
+  <a:themeElements>
+    <a:clrScheme name="LibreOffice">
+      <a:dk1>
+        <a:srgbClr val="000000"/>
+      </a:dk1>
+      <a:lt1>
+        <a:srgbClr val="ffffff"/>
+      </a:lt1>
+      <a:dk2>
+        <a:srgbClr val="000000"/>
+      </a:dk2>
+      <a:lt2>
+        <a:srgbClr val="ffffff"/>
+      </a:lt2>
+      <a:accent1>
+        <a:srgbClr val="18a303"/>
+      </a:accent1>
+      <a:accent2>
+        <a:srgbClr val="0369a3"/>
+      </a:accent2>
+      <a:accent3>
+        <a:srgbClr val="a33e03"/>
+      </a:accent3>
+      <a:accent4>
+        <a:srgbClr val="8e03a3"/>
+      </a:accent4>
+      <a:accent5>
+        <a:srgbClr val="c99c00"/>
+      </a:accent5>
+      <a:accent6>
+        <a:srgbClr val="c9211e"/>
+      </a:accent6>
+      <a:hlink>
+        <a:srgbClr val="0000ee"/>
+      </a:hlink>
+      <a:folHlink>
+        <a:srgbClr val="551a8b"/>
+      </a:folHlink>
+    </a:clrScheme>
+    <a:fontScheme name="Office">
+      <a:majorFont>
+        <a:latin typeface="Arial" pitchFamily="0" charset="1"/>
+        <a:ea typeface="DejaVu Sans" pitchFamily="0" charset="1"/>
+        <a:cs typeface="DejaVu Sans" pitchFamily="0" charset="1"/>
+      </a:majorFont>
+      <a:minorFont>
+        <a:latin typeface="Arial" pitchFamily="0" charset="1"/>
+        <a:ea typeface="DejaVu Sans" pitchFamily="0" charset="1"/>
+        <a:cs typeface="DejaVu Sans" pitchFamily="0" charset="1"/>
+      </a:minorFont>
+    </a:fontScheme>
+    <a:fmtScheme>
+      <a:fillStyleLst>
+        <a:solidFill>
+          <a:schemeClr val="phClr"/>
+        </a:solidFill>
+        <a:solidFill>
+          <a:schemeClr val="phClr"/>
+        </a:solidFill>
+        <a:solidFill>
+          <a:schemeClr val="phClr"/>
+        </a:solidFill>
+      </a:fillStyleLst>
+      <a:lnStyleLst>
+        <a:ln w="6350" cap="flat" cmpd="sng" algn="ctr">
+          <a:prstDash val="solid"/>
+          <a:miter/>
+        </a:ln>
+        <a:ln w="6350" cap="flat" cmpd="sng" algn="ctr">
+          <a:prstDash val="solid"/>
+          <a:miter/>
+        </a:ln>
+        <a:ln w="6350" cap="flat" cmpd="sng" algn="ctr">
+          <a:prstDash val="solid"/>
+          <a:miter/>
+        </a:ln>
+      </a:lnStyleLst>
+      <a:effectStyleLst>
+        <a:effectStyle>
+          <a:effectLst/>
+        </a:effectStyle>
+        <a:effectStyle>
+          <a:effectLst/>
+        </a:effectStyle>
+        <a:effectStyle>
+          <a:effectLst/>
+        </a:effectStyle>
+      </a:effectStyleLst>
+      <a:bgFillStyleLst>
+        <a:solidFill>
+          <a:schemeClr val="phClr"/>
+        </a:solidFill>
+        <a:solidFill>
+          <a:schemeClr val="phClr"/>
+        </a:solidFill>
+        <a:solidFill>
+          <a:schemeClr val="phClr"/>
+        </a:solidFill>
+      </a:bgFillStyleLst>
+    </a:fmtScheme>
+  </a:themeElements>
+</a:theme>
 </file>
</xml_diff>